<commit_message>
Figura 23: el sitio servido desde el servidor, abierto en el navegador
</commit_message>
<xml_diff>
--- a/documentacion/Anexo-Evidencias-Servidor.docx
+++ b/documentacion/Anexo-Evidencias-Servidor.docx
@@ -366,6 +366,59 @@
     </w:p>
     <w:p>
       <w:pPr>
+        <w:spacing w:before="200" w:after="60"/>
+        <w:jc w:val="center"/>
+      </w:pPr>
+      <w:r>
+        <w:drawing>
+          <wp:inline xmlns:a="http://schemas.openxmlformats.org/drawingml/2006/main" xmlns:pic="http://schemas.openxmlformats.org/drawingml/2006/picture">
+            <wp:extent cx="5394960" cy="2743677"/>
+            <wp:docPr id="7" name="Picture 7"/>
+            <wp:cNvGraphicFramePr>
+              <a:graphicFrameLocks noChangeAspect="1"/>
+            </wp:cNvGraphicFramePr>
+            <a:graphic>
+              <a:graphicData uri="http://schemas.openxmlformats.org/drawingml/2006/picture">
+                <pic:pic>
+                  <pic:nvPicPr>
+                    <pic:cNvPr id="0" name="07-sitio-navegador.png"/>
+                    <pic:cNvPicPr/>
+                  </pic:nvPicPr>
+                  <pic:blipFill>
+                    <a:blip r:embed="rId15"/>
+                    <a:stretch>
+                      <a:fillRect/>
+                    </a:stretch>
+                  </pic:blipFill>
+                  <pic:spPr>
+                    <a:xfrm>
+                      <a:off x="0" y="0"/>
+                      <a:ext cx="5394960" cy="2743677"/>
+                    </a:xfrm>
+                    <a:prstGeom prst="rect"/>
+                  </pic:spPr>
+                </pic:pic>
+              </a:graphicData>
+            </a:graphic>
+          </wp:inline>
+        </w:drawing>
+      </w:r>
+    </w:p>
+    <w:p>
+      <w:pPr>
+        <w:spacing w:after="280"/>
+        <w:jc w:val="center"/>
+      </w:pPr>
+      <w:r>
+        <w:rPr>
+          <w:rFonts w:ascii="Times New Roman" w:hAnsi="Times New Roman"/>
+          <w:sz w:val="18"/>
+        </w:rPr>
+        <w:t>Fig. 23. El sitio servido desde el servidor Ubuntu, abierto en el navegador de la estación de trabajo. La barra de direcciones muestra nivelup.local:8080, nombre resuelto mediante el archivo hosts hacia la dirección 192.168.1.60 y atendido por el host virtual de Apache.</w:t>
+      </w:r>
+    </w:p>
+    <w:p>
+      <w:pPr>
         <w:spacing w:after="120"/>
         <w:ind w:firstLine="432"/>
         <w:jc w:val="both"/>
@@ -376,7 +429,7 @@
           <w:b w:val="0"/>
           <w:sz w:val="22"/>
         </w:rPr>
-        <w:t>En conjunto, estas seis figuras cubren el requisito de evidenciar el correcto despliegue y funcionamiento del sitio sobre el servidor Ubuntu, complementando las capturas de la interfaz presentadas en la sección de resultados.</w:t>
+        <w:t>En conjunto, estas siete figuras cubren el requisito de evidenciar el correcto despliegue y funcionamiento del sitio sobre el servidor Ubuntu. La última cierra el recorrido: muestra el sitio servido desde la máquina Ubuntu y abierto en un equipo distinto de la red, complementando las capturas de la interfaz presentadas en la sección de resultados.</w:t>
       </w:r>
     </w:p>
     <w:sectPr>

</xml_diff>